<commit_message>
docs: update report 2, add context diagram
</commit_message>
<xml_diff>
--- a/SWR302/in_class/SWR302_SRD_Report2_Group2.docx
+++ b/SWR302/in_class/SWR302_SRD_Report2_Group2.docx
@@ -1597,18 +1597,14 @@
       </w:pPr>
       <w:r>
         <w:rPr>
-          <w:rFonts w:ascii="Cambria" w:eastAsiaTheme="majorEastAsia" w:hAnsi="Cambria" w:cstheme="majorBidi"/>
-          <w:b/>
+          <w:rFonts w:ascii="Cambria" w:hAnsi="Cambria"/>
           <w:noProof/>
-          <w:color w:val="2E74B5" w:themeColor="accent1" w:themeShade="BF"/>
-          <w:sz w:val="26"/>
-          <w:szCs w:val="26"/>
         </w:rPr>
         <w:drawing>
-          <wp:inline distT="0" distB="0" distL="0" distR="0" wp14:anchorId="74F8817B" wp14:editId="54237DD2">
+          <wp:inline distT="0" distB="0" distL="0" distR="0" wp14:anchorId="1847584D" wp14:editId="107956C0">
             <wp:extent cx="5746750" cy="3585210"/>
             <wp:effectExtent l="0" t="0" r="6350" b="0"/>
-            <wp:docPr id="1317987879" name="Picture 1"/>
+            <wp:docPr id="1834710561" name="Picture 1" descr="A diagram of software components&#10;&#10;AI-generated content may be incorrect."/>
             <wp:cNvGraphicFramePr>
               <a:graphicFrameLocks xmlns:a="http://schemas.openxmlformats.org/drawingml/2006/main" noChangeAspect="1"/>
             </wp:cNvGraphicFramePr>
@@ -1616,7 +1612,7 @@
               <a:graphicData uri="http://schemas.openxmlformats.org/drawingml/2006/picture">
                 <pic:pic xmlns:pic="http://schemas.openxmlformats.org/drawingml/2006/picture">
                   <pic:nvPicPr>
-                    <pic:cNvPr id="1317987879" name="Picture 1"/>
+                    <pic:cNvPr id="1834710561" name="Picture 1" descr="A diagram of software components&#10;&#10;AI-generated content may be incorrect."/>
                     <pic:cNvPicPr/>
                   </pic:nvPicPr>
                   <pic:blipFill>

</xml_diff>

<commit_message>
docs: update report 2 and context diagram, add bien_ban_report1
</commit_message>
<xml_diff>
--- a/SWR302/in_class/SWR302_SRD_Report2_Group2.docx
+++ b/SWR302/in_class/SWR302_SRD_Report2_Group2.docx
@@ -1601,10 +1601,10 @@
           <w:noProof/>
         </w:rPr>
         <w:drawing>
-          <wp:inline distT="0" distB="0" distL="0" distR="0" wp14:anchorId="5FDD17FF" wp14:editId="4EC7D9DA">
-            <wp:extent cx="5996940" cy="3848100"/>
-            <wp:effectExtent l="0" t="0" r="3810" b="0"/>
-            <wp:docPr id="1240313700" name="Picture 1" descr="A diagram of a system&#10;&#10;AI-generated content may be incorrect."/>
+          <wp:inline distT="0" distB="0" distL="0" distR="0" wp14:anchorId="7F1F36FC" wp14:editId="48ECCD87">
+            <wp:extent cx="6170930" cy="4052455"/>
+            <wp:effectExtent l="0" t="0" r="1270" b="5715"/>
+            <wp:docPr id="1987376388" name="Picture 1" descr="A diagram of a system&#10;&#10;AI-generated content may be incorrect."/>
             <wp:cNvGraphicFramePr>
               <a:graphicFrameLocks xmlns:a="http://schemas.openxmlformats.org/drawingml/2006/main" noChangeAspect="1"/>
             </wp:cNvGraphicFramePr>
@@ -1612,7 +1612,7 @@
               <a:graphicData uri="http://schemas.openxmlformats.org/drawingml/2006/picture">
                 <pic:pic xmlns:pic="http://schemas.openxmlformats.org/drawingml/2006/picture">
                   <pic:nvPicPr>
-                    <pic:cNvPr id="1240313700" name="Picture 1" descr="A diagram of a system&#10;&#10;AI-generated content may be incorrect."/>
+                    <pic:cNvPr id="1987376388" name="Picture 1" descr="A diagram of a system&#10;&#10;AI-generated content may be incorrect."/>
                     <pic:cNvPicPr/>
                   </pic:nvPicPr>
                   <pic:blipFill>
@@ -1630,7 +1630,7 @@
                   <pic:spPr>
                     <a:xfrm>
                       <a:off x="0" y="0"/>
-                      <a:ext cx="5996940" cy="3848100"/>
+                      <a:ext cx="6189408" cy="4064590"/>
                     </a:xfrm>
                     <a:prstGeom prst="rect">
                       <a:avLst/>
@@ -1648,6 +1648,13 @@
         </w:rPr>
         <w:br w:type="page"/>
       </w:r>
+      <w:r>
+        <w:rPr>
+          <w:rFonts w:ascii="Cambria" w:hAnsi="Cambria"/>
+        </w:rPr>
+        <w:lastRenderedPageBreak/>
+        <w:t>5</w:t>
+      </w:r>
     </w:p>
     <w:p>
       <w:pPr>
@@ -1661,7 +1668,6 @@
         <w:rPr>
           <w:rFonts w:ascii="Cambria" w:hAnsi="Cambria"/>
         </w:rPr>
-        <w:lastRenderedPageBreak/>
         <w:t>2. Business Process</w:t>
       </w:r>
       <w:bookmarkEnd w:id="6"/>

</xml_diff>

<commit_message>
fix: update report 2, diagram
</commit_message>
<xml_diff>
--- a/SWR302/in_class/SWR302_SRD_Report2_Group2.docx
+++ b/SWR302/in_class/SWR302_SRD_Report2_Group2.docx
@@ -1601,10 +1601,10 @@
           <w:noProof/>
         </w:rPr>
         <w:drawing>
-          <wp:inline distT="0" distB="0" distL="0" distR="0" wp14:anchorId="7F1F36FC" wp14:editId="48ECCD87">
-            <wp:extent cx="6170930" cy="4052455"/>
-            <wp:effectExtent l="0" t="0" r="1270" b="5715"/>
-            <wp:docPr id="1987376388" name="Picture 1" descr="A diagram of a system&#10;&#10;AI-generated content may be incorrect."/>
+          <wp:inline distT="0" distB="0" distL="0" distR="0" wp14:anchorId="545FF80A" wp14:editId="0CAB3109">
+            <wp:extent cx="6141720" cy="4495800"/>
+            <wp:effectExtent l="0" t="0" r="0" b="0"/>
+            <wp:docPr id="1780204789" name="Picture 1" descr="A diagram of a system&#10;&#10;AI-generated content may be incorrect."/>
             <wp:cNvGraphicFramePr>
               <a:graphicFrameLocks xmlns:a="http://schemas.openxmlformats.org/drawingml/2006/main" noChangeAspect="1"/>
             </wp:cNvGraphicFramePr>
@@ -1612,7 +1612,7 @@
               <a:graphicData uri="http://schemas.openxmlformats.org/drawingml/2006/picture">
                 <pic:pic xmlns:pic="http://schemas.openxmlformats.org/drawingml/2006/picture">
                   <pic:nvPicPr>
-                    <pic:cNvPr id="1987376388" name="Picture 1" descr="A diagram of a system&#10;&#10;AI-generated content may be incorrect."/>
+                    <pic:cNvPr id="1780204789" name="Picture 1" descr="A diagram of a system&#10;&#10;AI-generated content may be incorrect."/>
                     <pic:cNvPicPr/>
                   </pic:nvPicPr>
                   <pic:blipFill>
@@ -1630,7 +1630,7 @@
                   <pic:spPr>
                     <a:xfrm>
                       <a:off x="0" y="0"/>
-                      <a:ext cx="6189408" cy="4064590"/>
+                      <a:ext cx="6141720" cy="4495800"/>
                     </a:xfrm>
                     <a:prstGeom prst="rect">
                       <a:avLst/>
@@ -1691,10 +1691,10 @@
           <w:noProof/>
         </w:rPr>
         <w:drawing>
-          <wp:inline distT="0" distB="0" distL="114300" distR="114300" wp14:anchorId="49F757EB" wp14:editId="30F4AB3D">
-            <wp:extent cx="5746115" cy="3338195"/>
-            <wp:effectExtent l="0" t="0" r="14605" b="14605"/>
-            <wp:docPr id="2" name="Picture 2"/>
+          <wp:inline distT="0" distB="0" distL="0" distR="0" wp14:anchorId="446A2EA2" wp14:editId="6384A88B">
+            <wp:extent cx="5746750" cy="6760845"/>
+            <wp:effectExtent l="0" t="0" r="6350" b="1905"/>
+            <wp:docPr id="802240634" name="Picture 2" descr="A diagram of a project&#10;&#10;AI-generated content may be incorrect."/>
             <wp:cNvGraphicFramePr>
               <a:graphicFrameLocks xmlns:a="http://schemas.openxmlformats.org/drawingml/2006/main" noChangeAspect="1"/>
             </wp:cNvGraphicFramePr>
@@ -1702,13 +1702,17 @@
               <a:graphicData uri="http://schemas.openxmlformats.org/drawingml/2006/picture">
                 <pic:pic xmlns:pic="http://schemas.openxmlformats.org/drawingml/2006/picture">
                   <pic:nvPicPr>
-                    <pic:cNvPr id="2" name="Picture 2"/>
-                    <pic:cNvPicPr>
-                      <a:picLocks noChangeAspect="1"/>
-                    </pic:cNvPicPr>
+                    <pic:cNvPr id="802240634" name="Picture 2" descr="A diagram of a project&#10;&#10;AI-generated content may be incorrect."/>
+                    <pic:cNvPicPr/>
                   </pic:nvPicPr>
                   <pic:blipFill>
-                    <a:blip r:embed="rId9"/>
+                    <a:blip r:embed="rId9">
+                      <a:extLst>
+                        <a:ext uri="{28A0092B-C50C-407E-A947-70E740481C1C}">
+                          <a14:useLocalDpi xmlns:a14="http://schemas.microsoft.com/office/drawing/2010/main" val="0"/>
+                        </a:ext>
+                      </a:extLst>
+                    </a:blip>
                     <a:stretch>
                       <a:fillRect/>
                     </a:stretch>
@@ -1716,15 +1720,11 @@
                   <pic:spPr>
                     <a:xfrm>
                       <a:off x="0" y="0"/>
-                      <a:ext cx="5746115" cy="3338195"/>
+                      <a:ext cx="5746750" cy="6760845"/>
                     </a:xfrm>
                     <a:prstGeom prst="rect">
                       <a:avLst/>
                     </a:prstGeom>
-                    <a:noFill/>
-                    <a:ln>
-                      <a:noFill/>
-                    </a:ln>
                   </pic:spPr>
                 </pic:pic>
               </a:graphicData>
@@ -1865,7 +1865,7 @@
               <w:rPr>
                 <w:rFonts w:ascii="Cambria" w:hAnsi="Cambria" w:cs="Calibri"/>
               </w:rPr>
-              <w:t>Configure system</w:t>
+              <w:t>Start Course / Project Initialized</w:t>
             </w:r>
           </w:p>
         </w:tc>
@@ -1883,9 +1883,9 @@
             </w:pPr>
             <w:r>
               <w:rPr>
-                <w:rFonts w:ascii="Cambria" w:hAnsi="Cambria"/>
-              </w:rPr>
-              <w:t>Admin configures the system, creates student groups, and sets up user roles and permissions</w:t>
+                <w:rFonts w:ascii="Cambria" w:hAnsi="Cambria" w:cs="Calibri"/>
+              </w:rPr>
+              <w:t>The course or project is officially started, triggering the project management process.</w:t>
             </w:r>
           </w:p>
         </w:tc>
@@ -1929,9 +1929,9 @@
             </w:pPr>
             <w:r>
               <w:rPr>
-                <w:rFonts w:ascii="Cambria" w:hAnsi="Cambria"/>
-              </w:rPr>
-              <w:t>Assign lecturers</w:t>
+                <w:rFonts w:ascii="Cambria" w:hAnsi="Cambria" w:cs="Calibri"/>
+              </w:rPr>
+              <w:t>Manage Lecturers</w:t>
             </w:r>
           </w:p>
         </w:tc>
@@ -1949,9 +1949,9 @@
             </w:pPr>
             <w:r>
               <w:rPr>
-                <w:rFonts w:ascii="Cambria" w:hAnsi="Cambria"/>
-              </w:rPr>
-              <w:t>Admin assigns lecturers to be responsible for specific student groups</w:t>
+                <w:rFonts w:ascii="Cambria" w:hAnsi="Cambria" w:cs="Calibri"/>
+              </w:rPr>
+              <w:t>Admin manages lecturer accounts and assigns responsibilities within the system.</w:t>
             </w:r>
           </w:p>
         </w:tc>
@@ -1974,6 +1974,7 @@
               <w:rPr>
                 <w:rFonts w:ascii="Cambria" w:hAnsi="Cambria" w:cs="Calibri"/>
               </w:rPr>
+              <w:lastRenderedPageBreak/>
               <w:t>3</w:t>
             </w:r>
           </w:p>
@@ -2432,7 +2433,6 @@
                 <w:rFonts w:ascii="Cambria" w:hAnsi="Cambria" w:cs="Calibri"/>
                 <w:lang w:val="en-US"/>
               </w:rPr>
-              <w:lastRenderedPageBreak/>
               <w:t>10</w:t>
             </w:r>
           </w:p>
@@ -3415,7 +3415,6 @@
   <w:style w:type="character" w:default="1" w:styleId="DefaultParagraphFont">
     <w:name w:val="Default Paragraph Font"/>
     <w:uiPriority w:val="1"/>
-    <w:semiHidden/>
     <w:unhideWhenUsed/>
   </w:style>
   <w:style w:type="table" w:default="1" w:styleId="TableNormal">

</xml_diff>

<commit_message>
docs: reogranize report 2
</commit_message>
<xml_diff>
--- a/SWR302/in_class/SWR302_SRD_Report2_Group2.docx
+++ b/SWR302/in_class/SWR302_SRD_Report2_Group2.docx
@@ -1601,10 +1601,10 @@
           <w:noProof/>
         </w:rPr>
         <w:drawing>
-          <wp:inline distT="0" distB="0" distL="0" distR="0" wp14:anchorId="545FF80A" wp14:editId="0CAB3109">
-            <wp:extent cx="6141720" cy="4495800"/>
-            <wp:effectExtent l="0" t="0" r="0" b="0"/>
-            <wp:docPr id="1780204789" name="Picture 1" descr="A diagram of a system&#10;&#10;AI-generated content may be incorrect."/>
+          <wp:inline distT="0" distB="0" distL="0" distR="0" wp14:anchorId="2F0AA922" wp14:editId="0A46833C">
+            <wp:extent cx="6301740" cy="4511040"/>
+            <wp:effectExtent l="0" t="0" r="3810" b="3810"/>
+            <wp:docPr id="1948214377" name="Picture 1" descr="A diagram of a system&#10;&#10;AI-generated content may be incorrect."/>
             <wp:cNvGraphicFramePr>
               <a:graphicFrameLocks xmlns:a="http://schemas.openxmlformats.org/drawingml/2006/main" noChangeAspect="1"/>
             </wp:cNvGraphicFramePr>
@@ -1612,7 +1612,7 @@
               <a:graphicData uri="http://schemas.openxmlformats.org/drawingml/2006/picture">
                 <pic:pic xmlns:pic="http://schemas.openxmlformats.org/drawingml/2006/picture">
                   <pic:nvPicPr>
-                    <pic:cNvPr id="1780204789" name="Picture 1" descr="A diagram of a system&#10;&#10;AI-generated content may be incorrect."/>
+                    <pic:cNvPr id="1948214377" name="Picture 1" descr="A diagram of a system&#10;&#10;AI-generated content may be incorrect."/>
                     <pic:cNvPicPr/>
                   </pic:nvPicPr>
                   <pic:blipFill>
@@ -1630,7 +1630,7 @@
                   <pic:spPr>
                     <a:xfrm>
                       <a:off x="0" y="0"/>
-                      <a:ext cx="6141720" cy="4495800"/>
+                      <a:ext cx="6301740" cy="4511040"/>
                     </a:xfrm>
                     <a:prstGeom prst="rect">
                       <a:avLst/>
@@ -3415,6 +3415,7 @@
   <w:style w:type="character" w:default="1" w:styleId="DefaultParagraphFont">
     <w:name w:val="Default Paragraph Font"/>
     <w:uiPriority w:val="1"/>
+    <w:semiHidden/>
     <w:unhideWhenUsed/>
   </w:style>
   <w:style w:type="table" w:default="1" w:styleId="TableNormal">

</xml_diff>

<commit_message>
docs: alter rp2, rp3
</commit_message>
<xml_diff>
--- a/SWR302/in_class/SWR302_SRD_Report2_Group2.docx
+++ b/SWR302/in_class/SWR302_SRD_Report2_Group2.docx
@@ -23,7 +23,7 @@
           <w:lang w:val="en-US" w:eastAsia="ja-JP"/>
         </w:rPr>
         <w:drawing>
-          <wp:inline distT="0" distB="0" distL="0" distR="0" wp14:anchorId="481E98FE" wp14:editId="58E02BA1">
+          <wp:inline distT="0" distB="0" distL="0" distR="0" wp14:anchorId="1ECE6137" wp14:editId="6E743D5D">
             <wp:extent cx="2702560" cy="830580"/>
             <wp:effectExtent l="0" t="0" r="2540" b="7620"/>
             <wp:docPr id="5" name="Picture 5"/>
@@ -292,7 +292,6 @@
             </w:tabs>
             <w:rPr>
               <w:rFonts w:ascii="Cambria" w:eastAsiaTheme="minorEastAsia" w:hAnsi="Cambria"/>
-              <w:noProof/>
               <w:lang w:val="en-US" w:eastAsia="ja-JP"/>
             </w:rPr>
           </w:pPr>
@@ -319,55 +318,47 @@
               <w:rPr>
                 <w:rStyle w:val="Hyperlink"/>
                 <w:rFonts w:ascii="Cambria" w:hAnsi="Cambria"/>
-                <w:noProof/>
               </w:rPr>
               <w:t>Record of Changes</w:t>
             </w:r>
             <w:r>
               <w:rPr>
                 <w:rFonts w:ascii="Cambria" w:hAnsi="Cambria"/>
-                <w:noProof/>
               </w:rPr>
               <w:tab/>
             </w:r>
             <w:r>
               <w:rPr>
                 <w:rFonts w:ascii="Cambria" w:hAnsi="Cambria"/>
-                <w:noProof/>
               </w:rPr>
               <w:fldChar w:fldCharType="begin"/>
             </w:r>
             <w:r>
               <w:rPr>
                 <w:rFonts w:ascii="Cambria" w:hAnsi="Cambria"/>
-                <w:noProof/>
               </w:rPr>
               <w:instrText xml:space="preserve"> PAGEREF _Toc112351882 \h </w:instrText>
             </w:r>
             <w:r>
               <w:rPr>
                 <w:rFonts w:ascii="Cambria" w:hAnsi="Cambria"/>
-                <w:noProof/>
-              </w:rPr>
-            </w:r>
-            <w:r>
-              <w:rPr>
-                <w:rFonts w:ascii="Cambria" w:hAnsi="Cambria"/>
-                <w:noProof/>
+              </w:rPr>
+            </w:r>
+            <w:r>
+              <w:rPr>
+                <w:rFonts w:ascii="Cambria" w:hAnsi="Cambria"/>
               </w:rPr>
               <w:fldChar w:fldCharType="separate"/>
             </w:r>
             <w:r>
               <w:rPr>
                 <w:rFonts w:ascii="Cambria" w:hAnsi="Cambria"/>
-                <w:noProof/>
               </w:rPr>
               <w:t>3</w:t>
             </w:r>
             <w:r>
               <w:rPr>
                 <w:rFonts w:ascii="Cambria" w:hAnsi="Cambria"/>
-                <w:noProof/>
               </w:rPr>
               <w:fldChar w:fldCharType="end"/>
             </w:r>
@@ -381,7 +372,6 @@
             </w:tabs>
             <w:rPr>
               <w:rFonts w:ascii="Cambria" w:eastAsiaTheme="minorEastAsia" w:hAnsi="Cambria"/>
-              <w:noProof/>
               <w:lang w:val="en-US" w:eastAsia="ja-JP"/>
             </w:rPr>
           </w:pPr>
@@ -390,55 +380,47 @@
               <w:rPr>
                 <w:rStyle w:val="Hyperlink"/>
                 <w:rFonts w:ascii="Cambria" w:hAnsi="Cambria"/>
-                <w:noProof/>
               </w:rPr>
               <w:t>II. Overall Description</w:t>
             </w:r>
             <w:r>
               <w:rPr>
                 <w:rFonts w:ascii="Cambria" w:hAnsi="Cambria"/>
-                <w:noProof/>
               </w:rPr>
               <w:tab/>
             </w:r>
             <w:r>
               <w:rPr>
                 <w:rFonts w:ascii="Cambria" w:hAnsi="Cambria"/>
-                <w:noProof/>
               </w:rPr>
               <w:fldChar w:fldCharType="begin"/>
             </w:r>
             <w:r>
               <w:rPr>
                 <w:rFonts w:ascii="Cambria" w:hAnsi="Cambria"/>
-                <w:noProof/>
               </w:rPr>
               <w:instrText xml:space="preserve"> PAGEREF _Toc112351883 \h </w:instrText>
             </w:r>
             <w:r>
               <w:rPr>
                 <w:rFonts w:ascii="Cambria" w:hAnsi="Cambria"/>
-                <w:noProof/>
-              </w:rPr>
-            </w:r>
-            <w:r>
-              <w:rPr>
-                <w:rFonts w:ascii="Cambria" w:hAnsi="Cambria"/>
-                <w:noProof/>
+              </w:rPr>
+            </w:r>
+            <w:r>
+              <w:rPr>
+                <w:rFonts w:ascii="Cambria" w:hAnsi="Cambria"/>
               </w:rPr>
               <w:fldChar w:fldCharType="separate"/>
             </w:r>
             <w:r>
               <w:rPr>
                 <w:rFonts w:ascii="Cambria" w:hAnsi="Cambria"/>
-                <w:noProof/>
               </w:rPr>
               <w:t>4</w:t>
             </w:r>
             <w:r>
               <w:rPr>
                 <w:rFonts w:ascii="Cambria" w:hAnsi="Cambria"/>
-                <w:noProof/>
               </w:rPr>
               <w:fldChar w:fldCharType="end"/>
             </w:r>
@@ -452,7 +434,6 @@
             </w:tabs>
             <w:rPr>
               <w:rFonts w:ascii="Cambria" w:eastAsiaTheme="minorEastAsia" w:hAnsi="Cambria"/>
-              <w:noProof/>
               <w:lang w:val="en-US" w:eastAsia="ja-JP"/>
             </w:rPr>
           </w:pPr>
@@ -461,55 +442,47 @@
               <w:rPr>
                 <w:rStyle w:val="Hyperlink"/>
                 <w:rFonts w:ascii="Cambria" w:hAnsi="Cambria"/>
-                <w:noProof/>
               </w:rPr>
               <w:t>1. Product Overview</w:t>
             </w:r>
             <w:r>
               <w:rPr>
                 <w:rFonts w:ascii="Cambria" w:hAnsi="Cambria"/>
-                <w:noProof/>
               </w:rPr>
               <w:tab/>
             </w:r>
             <w:r>
               <w:rPr>
                 <w:rFonts w:ascii="Cambria" w:hAnsi="Cambria"/>
-                <w:noProof/>
               </w:rPr>
               <w:fldChar w:fldCharType="begin"/>
             </w:r>
             <w:r>
               <w:rPr>
                 <w:rFonts w:ascii="Cambria" w:hAnsi="Cambria"/>
-                <w:noProof/>
               </w:rPr>
               <w:instrText xml:space="preserve"> PAGEREF _Toc112351884 \h </w:instrText>
             </w:r>
             <w:r>
               <w:rPr>
                 <w:rFonts w:ascii="Cambria" w:hAnsi="Cambria"/>
-                <w:noProof/>
-              </w:rPr>
-            </w:r>
-            <w:r>
-              <w:rPr>
-                <w:rFonts w:ascii="Cambria" w:hAnsi="Cambria"/>
-                <w:noProof/>
+              </w:rPr>
+            </w:r>
+            <w:r>
+              <w:rPr>
+                <w:rFonts w:ascii="Cambria" w:hAnsi="Cambria"/>
               </w:rPr>
               <w:fldChar w:fldCharType="separate"/>
             </w:r>
             <w:r>
               <w:rPr>
                 <w:rFonts w:ascii="Cambria" w:hAnsi="Cambria"/>
-                <w:noProof/>
               </w:rPr>
               <w:t>4</w:t>
             </w:r>
             <w:r>
               <w:rPr>
                 <w:rFonts w:ascii="Cambria" w:hAnsi="Cambria"/>
-                <w:noProof/>
               </w:rPr>
               <w:fldChar w:fldCharType="end"/>
             </w:r>
@@ -523,7 +496,6 @@
             </w:tabs>
             <w:rPr>
               <w:rFonts w:ascii="Cambria" w:eastAsiaTheme="minorEastAsia" w:hAnsi="Cambria"/>
-              <w:noProof/>
               <w:lang w:val="en-US" w:eastAsia="ja-JP"/>
             </w:rPr>
           </w:pPr>
@@ -532,55 +504,47 @@
               <w:rPr>
                 <w:rStyle w:val="Hyperlink"/>
                 <w:rFonts w:ascii="Cambria" w:hAnsi="Cambria"/>
-                <w:noProof/>
               </w:rPr>
               <w:t>2. Business Process</w:t>
             </w:r>
             <w:r>
               <w:rPr>
                 <w:rFonts w:ascii="Cambria" w:hAnsi="Cambria"/>
-                <w:noProof/>
               </w:rPr>
               <w:tab/>
             </w:r>
             <w:r>
               <w:rPr>
                 <w:rFonts w:ascii="Cambria" w:hAnsi="Cambria"/>
-                <w:noProof/>
               </w:rPr>
               <w:fldChar w:fldCharType="begin"/>
             </w:r>
             <w:r>
               <w:rPr>
                 <w:rFonts w:ascii="Cambria" w:hAnsi="Cambria"/>
-                <w:noProof/>
               </w:rPr>
               <w:instrText xml:space="preserve"> PAGEREF _Toc112351885 \h </w:instrText>
             </w:r>
             <w:r>
               <w:rPr>
                 <w:rFonts w:ascii="Cambria" w:hAnsi="Cambria"/>
-                <w:noProof/>
-              </w:rPr>
-            </w:r>
-            <w:r>
-              <w:rPr>
-                <w:rFonts w:ascii="Cambria" w:hAnsi="Cambria"/>
-                <w:noProof/>
+              </w:rPr>
+            </w:r>
+            <w:r>
+              <w:rPr>
+                <w:rFonts w:ascii="Cambria" w:hAnsi="Cambria"/>
               </w:rPr>
               <w:fldChar w:fldCharType="separate"/>
             </w:r>
             <w:r>
               <w:rPr>
                 <w:rFonts w:ascii="Cambria" w:hAnsi="Cambria"/>
-                <w:noProof/>
               </w:rPr>
               <w:t>5</w:t>
             </w:r>
             <w:r>
               <w:rPr>
                 <w:rFonts w:ascii="Cambria" w:hAnsi="Cambria"/>
-                <w:noProof/>
               </w:rPr>
               <w:fldChar w:fldCharType="end"/>
             </w:r>
@@ -628,8 +592,8 @@
         </w:rPr>
       </w:pPr>
       <w:bookmarkStart w:id="0" w:name="_Toc83330272"/>
-      <w:bookmarkStart w:id="1" w:name="_Toc83330363"/>
-      <w:bookmarkStart w:id="2" w:name="_Toc112351882"/>
+      <w:bookmarkStart w:id="1" w:name="_Toc112351882"/>
+      <w:bookmarkStart w:id="2" w:name="_Toc83330363"/>
       <w:bookmarkStart w:id="3" w:name="_Toc82376799"/>
       <w:r>
         <w:rPr>
@@ -1588,23 +1552,21 @@
     <w:p>
       <w:pPr>
         <w:rPr>
-          <w:rFonts w:ascii="Cambria" w:eastAsiaTheme="majorEastAsia" w:hAnsi="Cambria" w:cstheme="majorBidi"/>
-          <w:b/>
-          <w:color w:val="2E74B5" w:themeColor="accent1" w:themeShade="BF"/>
-          <w:sz w:val="26"/>
-          <w:szCs w:val="26"/>
+          <w:rFonts w:ascii="Cambria" w:hAnsi="Cambria"/>
+          <w:lang w:val="en-US"/>
         </w:rPr>
       </w:pPr>
       <w:r>
         <w:rPr>
           <w:rFonts w:ascii="Cambria" w:hAnsi="Cambria"/>
           <w:noProof/>
+          <w:lang w:val="en-US"/>
         </w:rPr>
         <w:drawing>
-          <wp:inline distT="0" distB="0" distL="0" distR="0" wp14:anchorId="2F0AA922" wp14:editId="0A46833C">
-            <wp:extent cx="6301740" cy="4511040"/>
-            <wp:effectExtent l="0" t="0" r="3810" b="3810"/>
-            <wp:docPr id="1948214377" name="Picture 1" descr="A diagram of a system&#10;&#10;AI-generated content may be incorrect."/>
+          <wp:inline distT="0" distB="0" distL="0" distR="0" wp14:anchorId="6ECF7731" wp14:editId="05BD871C">
+            <wp:extent cx="5746750" cy="3092450"/>
+            <wp:effectExtent l="0" t="0" r="6350" b="0"/>
+            <wp:docPr id="304547857" name="Picture 1" descr="A diagram of a software system&#10;&#10;AI-generated content may be incorrect."/>
             <wp:cNvGraphicFramePr>
               <a:graphicFrameLocks xmlns:a="http://schemas.openxmlformats.org/drawingml/2006/main" noChangeAspect="1"/>
             </wp:cNvGraphicFramePr>
@@ -1612,7 +1574,7 @@
               <a:graphicData uri="http://schemas.openxmlformats.org/drawingml/2006/picture">
                 <pic:pic xmlns:pic="http://schemas.openxmlformats.org/drawingml/2006/picture">
                   <pic:nvPicPr>
-                    <pic:cNvPr id="1948214377" name="Picture 1" descr="A diagram of a system&#10;&#10;AI-generated content may be incorrect."/>
+                    <pic:cNvPr id="304547857" name="Picture 1" descr="A diagram of a software system&#10;&#10;AI-generated content may be incorrect."/>
                     <pic:cNvPicPr/>
                   </pic:nvPicPr>
                   <pic:blipFill>
@@ -1630,7 +1592,7 @@
                   <pic:spPr>
                     <a:xfrm>
                       <a:off x="0" y="0"/>
-                      <a:ext cx="6301740" cy="4511040"/>
+                      <a:ext cx="5746750" cy="3092450"/>
                     </a:xfrm>
                     <a:prstGeom prst="rect">
                       <a:avLst/>
@@ -1642,6 +1604,17 @@
           </wp:inline>
         </w:drawing>
       </w:r>
+    </w:p>
+    <w:p>
+      <w:pPr>
+        <w:rPr>
+          <w:rFonts w:ascii="Cambria" w:eastAsiaTheme="majorEastAsia" w:hAnsi="Cambria" w:cstheme="majorBidi"/>
+          <w:b/>
+          <w:color w:val="2E74B5" w:themeColor="accent1" w:themeShade="BF"/>
+          <w:sz w:val="26"/>
+          <w:szCs w:val="26"/>
+        </w:rPr>
+      </w:pPr>
       <w:r>
         <w:rPr>
           <w:rFonts w:ascii="Cambria" w:hAnsi="Cambria"/>
@@ -1687,14 +1660,13 @@
       </w:pPr>
       <w:r>
         <w:rPr>
-          <w:rFonts w:ascii="Cambria" w:hAnsi="Cambria"/>
           <w:noProof/>
         </w:rPr>
         <w:drawing>
-          <wp:inline distT="0" distB="0" distL="0" distR="0" wp14:anchorId="446A2EA2" wp14:editId="6384A88B">
-            <wp:extent cx="5746750" cy="6760845"/>
-            <wp:effectExtent l="0" t="0" r="6350" b="1905"/>
-            <wp:docPr id="802240634" name="Picture 2" descr="A diagram of a project&#10;&#10;AI-generated content may be incorrect."/>
+          <wp:inline distT="0" distB="0" distL="114300" distR="114300" wp14:anchorId="1981C42F" wp14:editId="2250036A">
+            <wp:extent cx="4168140" cy="4693920"/>
+            <wp:effectExtent l="0" t="0" r="7620" b="0"/>
+            <wp:docPr id="1" name="Picture 1"/>
             <wp:cNvGraphicFramePr>
               <a:graphicFrameLocks xmlns:a="http://schemas.openxmlformats.org/drawingml/2006/main" noChangeAspect="1"/>
             </wp:cNvGraphicFramePr>
@@ -1702,17 +1674,13 @@
               <a:graphicData uri="http://schemas.openxmlformats.org/drawingml/2006/picture">
                 <pic:pic xmlns:pic="http://schemas.openxmlformats.org/drawingml/2006/picture">
                   <pic:nvPicPr>
-                    <pic:cNvPr id="802240634" name="Picture 2" descr="A diagram of a project&#10;&#10;AI-generated content may be incorrect."/>
-                    <pic:cNvPicPr/>
+                    <pic:cNvPr id="1" name="Picture 1"/>
+                    <pic:cNvPicPr>
+                      <a:picLocks noChangeAspect="1"/>
+                    </pic:cNvPicPr>
                   </pic:nvPicPr>
                   <pic:blipFill>
-                    <a:blip r:embed="rId9">
-                      <a:extLst>
-                        <a:ext uri="{28A0092B-C50C-407E-A947-70E740481C1C}">
-                          <a14:useLocalDpi xmlns:a14="http://schemas.microsoft.com/office/drawing/2010/main" val="0"/>
-                        </a:ext>
-                      </a:extLst>
-                    </a:blip>
+                    <a:blip r:embed="rId9"/>
                     <a:stretch>
                       <a:fillRect/>
                     </a:stretch>
@@ -1720,11 +1688,15 @@
                   <pic:spPr>
                     <a:xfrm>
                       <a:off x="0" y="0"/>
-                      <a:ext cx="5746750" cy="6760845"/>
+                      <a:ext cx="4168140" cy="4693920"/>
                     </a:xfrm>
                     <a:prstGeom prst="rect">
                       <a:avLst/>
                     </a:prstGeom>
+                    <a:noFill/>
+                    <a:ln>
+                      <a:noFill/>
+                    </a:ln>
                   </pic:spPr>
                 </pic:pic>
               </a:graphicData>
@@ -1749,8 +1721,8 @@
       </w:tblPr>
       <w:tblGrid>
         <w:gridCol w:w="494"/>
-        <w:gridCol w:w="1671"/>
-        <w:gridCol w:w="6767"/>
+        <w:gridCol w:w="1669"/>
+        <w:gridCol w:w="6769"/>
       </w:tblGrid>
       <w:tr>
         <w:trPr>
@@ -1758,7 +1730,7 @@
         </w:trPr>
         <w:tc>
           <w:tcPr>
-            <w:tcW w:w="233" w:type="pct"/>
+            <w:tcW w:w="269" w:type="pct"/>
             <w:shd w:val="clear" w:color="auto" w:fill="FFE8E1"/>
             <w:vAlign w:val="center"/>
           </w:tcPr>
@@ -1782,7 +1754,7 @@
         </w:tc>
         <w:tc>
           <w:tcPr>
-            <w:tcW w:w="957" w:type="pct"/>
+            <w:tcW w:w="938" w:type="pct"/>
             <w:shd w:val="clear" w:color="auto" w:fill="FFE8E1"/>
             <w:vAlign w:val="center"/>
           </w:tcPr>
@@ -1805,7 +1777,7 @@
         </w:tc>
         <w:tc>
           <w:tcPr>
-            <w:tcW w:w="3810" w:type="pct"/>
+            <w:tcW w:w="3791" w:type="pct"/>
             <w:shd w:val="clear" w:color="auto" w:fill="FFE8E1"/>
             <w:vAlign w:val="center"/>
           </w:tcPr>
@@ -1830,7 +1802,7 @@
       <w:tr>
         <w:tc>
           <w:tcPr>
-            <w:tcW w:w="233" w:type="pct"/>
+            <w:tcW w:w="269" w:type="pct"/>
             <w:shd w:val="clear" w:color="auto" w:fill="auto"/>
             <w:vAlign w:val="center"/>
           </w:tcPr>
@@ -1851,7 +1823,7 @@
         </w:tc>
         <w:tc>
           <w:tcPr>
-            <w:tcW w:w="957" w:type="pct"/>
+            <w:tcW w:w="938" w:type="pct"/>
             <w:shd w:val="clear" w:color="auto" w:fill="auto"/>
             <w:vAlign w:val="center"/>
           </w:tcPr>
@@ -1862,16 +1834,13 @@
               </w:rPr>
             </w:pPr>
             <w:r>
-              <w:rPr>
-                <w:rFonts w:ascii="Cambria" w:hAnsi="Cambria" w:cs="Calibri"/>
-              </w:rPr>
-              <w:t>Start Course / Project Initialized</w:t>
-            </w:r>
-          </w:p>
-        </w:tc>
-        <w:tc>
-          <w:tcPr>
-            <w:tcW w:w="3810" w:type="pct"/>
+              <w:t>Start semester</w:t>
+            </w:r>
+          </w:p>
+        </w:tc>
+        <w:tc>
+          <w:tcPr>
+            <w:tcW w:w="3791" w:type="pct"/>
             <w:shd w:val="clear" w:color="auto" w:fill="auto"/>
             <w:vAlign w:val="center"/>
           </w:tcPr>
@@ -1883,9 +1852,9 @@
             </w:pPr>
             <w:r>
               <w:rPr>
-                <w:rFonts w:ascii="Cambria" w:hAnsi="Cambria" w:cs="Calibri"/>
-              </w:rPr>
-              <w:t>The course or project is officially started, triggering the project management process.</w:t>
+                <w:rFonts w:ascii="Cambria" w:hAnsi="Cambria"/>
+              </w:rPr>
+              <w:t>The administrator initializes a new academic semester in the system.</w:t>
             </w:r>
           </w:p>
         </w:tc>
@@ -1896,7 +1865,7 @@
         </w:trPr>
         <w:tc>
           <w:tcPr>
-            <w:tcW w:w="233" w:type="pct"/>
+            <w:tcW w:w="269" w:type="pct"/>
             <w:shd w:val="clear" w:color="auto" w:fill="auto"/>
             <w:vAlign w:val="center"/>
           </w:tcPr>
@@ -1917,7 +1886,7 @@
         </w:tc>
         <w:tc>
           <w:tcPr>
-            <w:tcW w:w="957" w:type="pct"/>
+            <w:tcW w:w="938" w:type="pct"/>
             <w:shd w:val="clear" w:color="auto" w:fill="auto"/>
             <w:vAlign w:val="center"/>
           </w:tcPr>
@@ -1929,15 +1898,15 @@
             </w:pPr>
             <w:r>
               <w:rPr>
-                <w:rFonts w:ascii="Cambria" w:hAnsi="Cambria" w:cs="Calibri"/>
-              </w:rPr>
-              <w:t>Manage Lecturers</w:t>
-            </w:r>
-          </w:p>
-        </w:tc>
-        <w:tc>
-          <w:tcPr>
-            <w:tcW w:w="3810" w:type="pct"/>
+                <w:rFonts w:ascii="Cambria" w:hAnsi="Cambria"/>
+              </w:rPr>
+              <w:t>Add lecturers and students to the class</w:t>
+            </w:r>
+          </w:p>
+        </w:tc>
+        <w:tc>
+          <w:tcPr>
+            <w:tcW w:w="3791" w:type="pct"/>
             <w:shd w:val="clear" w:color="auto" w:fill="auto"/>
             <w:vAlign w:val="center"/>
           </w:tcPr>
@@ -1949,9 +1918,9 @@
             </w:pPr>
             <w:r>
               <w:rPr>
-                <w:rFonts w:ascii="Cambria" w:hAnsi="Cambria" w:cs="Calibri"/>
-              </w:rPr>
-              <w:t>Admin manages lecturer accounts and assigns responsibilities within the system.</w:t>
+                <w:rFonts w:ascii="Cambria" w:hAnsi="Cambria"/>
+              </w:rPr>
+              <w:t>The administrator adds lecturers and students to the class for the semester.</w:t>
             </w:r>
           </w:p>
         </w:tc>
@@ -1959,7 +1928,7 @@
       <w:tr>
         <w:tc>
           <w:tcPr>
-            <w:tcW w:w="233" w:type="pct"/>
+            <w:tcW w:w="269" w:type="pct"/>
             <w:shd w:val="clear" w:color="auto" w:fill="auto"/>
             <w:vAlign w:val="center"/>
           </w:tcPr>
@@ -1974,14 +1943,13 @@
               <w:rPr>
                 <w:rFonts w:ascii="Cambria" w:hAnsi="Cambria" w:cs="Calibri"/>
               </w:rPr>
-              <w:lastRenderedPageBreak/>
               <w:t>3</w:t>
             </w:r>
           </w:p>
         </w:tc>
         <w:tc>
           <w:tcPr>
-            <w:tcW w:w="957" w:type="pct"/>
+            <w:tcW w:w="938" w:type="pct"/>
             <w:shd w:val="clear" w:color="auto" w:fill="auto"/>
             <w:vAlign w:val="center"/>
           </w:tcPr>
@@ -1995,13 +1963,13 @@
               <w:rPr>
                 <w:rFonts w:ascii="Cambria" w:hAnsi="Cambria"/>
               </w:rPr>
-              <w:t>Configure Jira &amp; GitHub integration</w:t>
-            </w:r>
-          </w:p>
-        </w:tc>
-        <w:tc>
-          <w:tcPr>
-            <w:tcW w:w="3810" w:type="pct"/>
+              <w:t>Create groups and assign topics</w:t>
+            </w:r>
+          </w:p>
+        </w:tc>
+        <w:tc>
+          <w:tcPr>
+            <w:tcW w:w="3791" w:type="pct"/>
             <w:shd w:val="clear" w:color="auto" w:fill="auto"/>
             <w:vAlign w:val="center"/>
           </w:tcPr>
@@ -2015,7 +1983,7 @@
               <w:rPr>
                 <w:rFonts w:ascii="Cambria" w:hAnsi="Cambria"/>
               </w:rPr>
-              <w:t>Admin configures API connections to integrate the system with Jira and GitHub</w:t>
+              <w:t>The lecturer creates student groups and assigns project topics to each group.</w:t>
             </w:r>
           </w:p>
         </w:tc>
@@ -2023,7 +1991,7 @@
       <w:tr>
         <w:tc>
           <w:tcPr>
-            <w:tcW w:w="233" w:type="pct"/>
+            <w:tcW w:w="269" w:type="pct"/>
             <w:shd w:val="clear" w:color="auto" w:fill="auto"/>
             <w:vAlign w:val="center"/>
           </w:tcPr>
@@ -2046,7 +2014,7 @@
         </w:tc>
         <w:tc>
           <w:tcPr>
-            <w:tcW w:w="957" w:type="pct"/>
+            <w:tcW w:w="938" w:type="pct"/>
             <w:shd w:val="clear" w:color="auto" w:fill="auto"/>
             <w:vAlign w:val="center"/>
           </w:tcPr>
@@ -2060,13 +2028,13 @@
               <w:rPr>
                 <w:rFonts w:ascii="Cambria" w:hAnsi="Cambria"/>
               </w:rPr>
-              <w:t>Synchronize project data</w:t>
-            </w:r>
-          </w:p>
-        </w:tc>
-        <w:tc>
-          <w:tcPr>
-            <w:tcW w:w="3810" w:type="pct"/>
+              <w:t>Start project</w:t>
+            </w:r>
+          </w:p>
+        </w:tc>
+        <w:tc>
+          <w:tcPr>
+            <w:tcW w:w="3791" w:type="pct"/>
             <w:shd w:val="clear" w:color="auto" w:fill="auto"/>
             <w:vAlign w:val="center"/>
           </w:tcPr>
@@ -2080,7 +2048,7 @@
               <w:rPr>
                 <w:rFonts w:ascii="Cambria" w:hAnsi="Cambria"/>
               </w:rPr>
-              <w:t>The system automatically synchronizes epics, user stories, tasks, and sprints from Jira</w:t>
+              <w:t>The team leader initializes the project for the assigned group.</w:t>
             </w:r>
           </w:p>
         </w:tc>
@@ -2088,7 +2056,7 @@
       <w:tr>
         <w:tc>
           <w:tcPr>
-            <w:tcW w:w="233" w:type="pct"/>
+            <w:tcW w:w="269" w:type="pct"/>
             <w:shd w:val="clear" w:color="auto" w:fill="auto"/>
             <w:vAlign w:val="center"/>
           </w:tcPr>
@@ -2111,7 +2079,7 @@
         </w:tc>
         <w:tc>
           <w:tcPr>
-            <w:tcW w:w="957" w:type="pct"/>
+            <w:tcW w:w="938" w:type="pct"/>
             <w:shd w:val="clear" w:color="auto" w:fill="auto"/>
             <w:vAlign w:val="center"/>
           </w:tcPr>
@@ -2125,13 +2093,13 @@
               <w:rPr>
                 <w:rFonts w:ascii="Cambria" w:hAnsi="Cambria"/>
               </w:rPr>
-              <w:t>Manage requirements and tasks</w:t>
-            </w:r>
-          </w:p>
-        </w:tc>
-        <w:tc>
-          <w:tcPr>
-            <w:tcW w:w="3810" w:type="pct"/>
+              <w:t>Support Jira and GitHub configuration</w:t>
+            </w:r>
+          </w:p>
+        </w:tc>
+        <w:tc>
+          <w:tcPr>
+            <w:tcW w:w="3791" w:type="pct"/>
             <w:shd w:val="clear" w:color="auto" w:fill="auto"/>
             <w:vAlign w:val="center"/>
           </w:tcPr>
@@ -2145,7 +2113,7 @@
               <w:rPr>
                 <w:rFonts w:ascii="Cambria" w:hAnsi="Cambria"/>
               </w:rPr>
-              <w:t>Team Leader manages requirements and assigns tasks to team members</w:t>
+              <w:t>The administrator supports the team leader in configuring Jira and GitHub integration.</w:t>
             </w:r>
           </w:p>
         </w:tc>
@@ -2153,7 +2121,7 @@
       <w:tr>
         <w:tc>
           <w:tcPr>
-            <w:tcW w:w="233" w:type="pct"/>
+            <w:tcW w:w="269" w:type="pct"/>
             <w:shd w:val="clear" w:color="auto" w:fill="auto"/>
             <w:vAlign w:val="center"/>
           </w:tcPr>
@@ -2176,7 +2144,7 @@
         </w:tc>
         <w:tc>
           <w:tcPr>
-            <w:tcW w:w="957" w:type="pct"/>
+            <w:tcW w:w="938" w:type="pct"/>
             <w:shd w:val="clear" w:color="auto" w:fill="auto"/>
             <w:vAlign w:val="center"/>
           </w:tcPr>
@@ -2190,13 +2158,13 @@
               <w:rPr>
                 <w:rFonts w:ascii="Cambria" w:hAnsi="Cambria"/>
               </w:rPr>
-              <w:t>Perform development tasks</w:t>
-            </w:r>
-          </w:p>
-        </w:tc>
-        <w:tc>
-          <w:tcPr>
-            <w:tcW w:w="3810" w:type="pct"/>
+              <w:t>Create Jira and GitHub tokens</w:t>
+            </w:r>
+          </w:p>
+        </w:tc>
+        <w:tc>
+          <w:tcPr>
+            <w:tcW w:w="3791" w:type="pct"/>
             <w:shd w:val="clear" w:color="auto" w:fill="auto"/>
             <w:vAlign w:val="center"/>
           </w:tcPr>
@@ -2210,7 +2178,7 @@
               <w:rPr>
                 <w:rFonts w:ascii="Cambria" w:hAnsi="Cambria"/>
               </w:rPr>
-              <w:t>Team Members perform the tasks assigned to them</w:t>
+              <w:t>The team leader creates and configures Jira and GitHub access tokens for integration.</w:t>
             </w:r>
           </w:p>
         </w:tc>
@@ -2218,7 +2186,7 @@
       <w:tr>
         <w:tc>
           <w:tcPr>
-            <w:tcW w:w="233" w:type="pct"/>
+            <w:tcW w:w="269" w:type="pct"/>
             <w:shd w:val="clear" w:color="auto" w:fill="auto"/>
             <w:vAlign w:val="center"/>
           </w:tcPr>
@@ -2241,7 +2209,7 @@
         </w:tc>
         <w:tc>
           <w:tcPr>
-            <w:tcW w:w="957" w:type="pct"/>
+            <w:tcW w:w="938" w:type="pct"/>
             <w:shd w:val="clear" w:color="auto" w:fill="auto"/>
             <w:vAlign w:val="center"/>
           </w:tcPr>
@@ -2255,13 +2223,20 @@
               <w:rPr>
                 <w:rFonts w:ascii="Cambria" w:hAnsi="Cambria"/>
               </w:rPr>
-              <w:t>Update task status</w:t>
-            </w:r>
-          </w:p>
-        </w:tc>
-        <w:tc>
-          <w:tcPr>
-            <w:tcW w:w="3810" w:type="pct"/>
+              <w:t xml:space="preserve">Define and manage </w:t>
+            </w:r>
+            <w:r>
+              <w:rPr>
+                <w:rFonts w:ascii="Cambria" w:hAnsi="Cambria"/>
+              </w:rPr>
+              <w:lastRenderedPageBreak/>
+              <w:t>requirements and tasks</w:t>
+            </w:r>
+          </w:p>
+        </w:tc>
+        <w:tc>
+          <w:tcPr>
+            <w:tcW w:w="3791" w:type="pct"/>
             <w:shd w:val="clear" w:color="auto" w:fill="auto"/>
             <w:vAlign w:val="center"/>
           </w:tcPr>
@@ -2275,7 +2250,8 @@
               <w:rPr>
                 <w:rFonts w:ascii="Cambria" w:hAnsi="Cambria"/>
               </w:rPr>
-              <w:t>Team Members update task status on Jira</w:t>
+              <w:lastRenderedPageBreak/>
+              <w:t>The team leader defines and manages project requirements and tasks, which are stored in Jira.</w:t>
             </w:r>
           </w:p>
         </w:tc>
@@ -2283,7 +2259,7 @@
       <w:tr>
         <w:tc>
           <w:tcPr>
-            <w:tcW w:w="233" w:type="pct"/>
+            <w:tcW w:w="269" w:type="pct"/>
             <w:shd w:val="clear" w:color="auto" w:fill="auto"/>
             <w:vAlign w:val="center"/>
           </w:tcPr>
@@ -2306,7 +2282,7 @@
         </w:tc>
         <w:tc>
           <w:tcPr>
-            <w:tcW w:w="957" w:type="pct"/>
+            <w:tcW w:w="938" w:type="pct"/>
             <w:shd w:val="clear" w:color="auto" w:fill="auto"/>
             <w:vAlign w:val="center"/>
           </w:tcPr>
@@ -2320,13 +2296,13 @@
               <w:rPr>
                 <w:rFonts w:ascii="Cambria" w:hAnsi="Cambria"/>
               </w:rPr>
-              <w:t>Commit source code</w:t>
-            </w:r>
-          </w:p>
-        </w:tc>
-        <w:tc>
-          <w:tcPr>
-            <w:tcW w:w="3810" w:type="pct"/>
+              <w:t>View group task statistics</w:t>
+            </w:r>
+          </w:p>
+        </w:tc>
+        <w:tc>
+          <w:tcPr>
+            <w:tcW w:w="3791" w:type="pct"/>
             <w:shd w:val="clear" w:color="auto" w:fill="auto"/>
             <w:vAlign w:val="center"/>
           </w:tcPr>
@@ -2340,7 +2316,7 @@
               <w:rPr>
                 <w:rFonts w:ascii="Cambria" w:hAnsi="Cambria"/>
               </w:rPr>
-              <w:t>Team Members commit source code to GitHub repositories</w:t>
+              <w:t>The lecturer views group-level task statistics retrieved from Jira.</w:t>
             </w:r>
           </w:p>
         </w:tc>
@@ -2348,7 +2324,7 @@
       <w:tr>
         <w:tc>
           <w:tcPr>
-            <w:tcW w:w="233" w:type="pct"/>
+            <w:tcW w:w="269" w:type="pct"/>
             <w:shd w:val="clear" w:color="auto" w:fill="auto"/>
             <w:vAlign w:val="center"/>
           </w:tcPr>
@@ -2371,7 +2347,7 @@
         </w:tc>
         <w:tc>
           <w:tcPr>
-            <w:tcW w:w="957" w:type="pct"/>
+            <w:tcW w:w="938" w:type="pct"/>
             <w:shd w:val="clear" w:color="auto" w:fill="auto"/>
             <w:vAlign w:val="center"/>
           </w:tcPr>
@@ -2385,13 +2361,13 @@
               <w:rPr>
                 <w:rFonts w:ascii="Cambria" w:hAnsi="Cambria"/>
               </w:rPr>
-              <w:t>Collect development data</w:t>
-            </w:r>
-          </w:p>
-        </w:tc>
-        <w:tc>
-          <w:tcPr>
-            <w:tcW w:w="3810" w:type="pct"/>
+              <w:t>View group commit statistics</w:t>
+            </w:r>
+          </w:p>
+        </w:tc>
+        <w:tc>
+          <w:tcPr>
+            <w:tcW w:w="3791" w:type="pct"/>
             <w:shd w:val="clear" w:color="auto" w:fill="auto"/>
             <w:vAlign w:val="center"/>
           </w:tcPr>
@@ -2405,7 +2381,7 @@
               <w:rPr>
                 <w:rFonts w:ascii="Cambria" w:hAnsi="Cambria"/>
               </w:rPr>
-              <w:t>The system collects commits, pull requests, and activity history from GitHub</w:t>
+              <w:t>The lecturer views group-level commit statistics retrieved from GitHub.</w:t>
             </w:r>
           </w:p>
         </w:tc>
@@ -2416,7 +2392,7 @@
         </w:trPr>
         <w:tc>
           <w:tcPr>
-            <w:tcW w:w="233" w:type="pct"/>
+            <w:tcW w:w="269" w:type="pct"/>
             <w:shd w:val="clear" w:color="auto" w:fill="auto"/>
             <w:vAlign w:val="center"/>
           </w:tcPr>
@@ -2439,7 +2415,7 @@
         </w:tc>
         <w:tc>
           <w:tcPr>
-            <w:tcW w:w="957" w:type="pct"/>
+            <w:tcW w:w="938" w:type="pct"/>
             <w:shd w:val="clear" w:color="auto" w:fill="auto"/>
             <w:vAlign w:val="center"/>
           </w:tcPr>
@@ -2453,13 +2429,13 @@
               <w:rPr>
                 <w:rFonts w:ascii="Cambria" w:hAnsi="Cambria"/>
               </w:rPr>
-              <w:t>Analyze and aggregate data</w:t>
-            </w:r>
-          </w:p>
-        </w:tc>
-        <w:tc>
-          <w:tcPr>
-            <w:tcW w:w="3810" w:type="pct"/>
+              <w:t>View team task statistics</w:t>
+            </w:r>
+          </w:p>
+        </w:tc>
+        <w:tc>
+          <w:tcPr>
+            <w:tcW w:w="3791" w:type="pct"/>
             <w:shd w:val="clear" w:color="auto" w:fill="auto"/>
             <w:vAlign w:val="center"/>
           </w:tcPr>
@@ -2473,7 +2449,7 @@
               <w:rPr>
                 <w:rFonts w:ascii="Cambria" w:hAnsi="Cambria"/>
               </w:rPr>
-              <w:t>The system analyzes sprint progress and individual contribution levels</w:t>
+              <w:t>The team leader views team task statistics retrieved from Jira.</w:t>
             </w:r>
           </w:p>
         </w:tc>
@@ -2481,7 +2457,7 @@
       <w:tr>
         <w:tc>
           <w:tcPr>
-            <w:tcW w:w="233" w:type="pct"/>
+            <w:tcW w:w="269" w:type="pct"/>
             <w:shd w:val="clear" w:color="auto" w:fill="auto"/>
             <w:vAlign w:val="center"/>
           </w:tcPr>
@@ -2504,7 +2480,7 @@
         </w:tc>
         <w:tc>
           <w:tcPr>
-            <w:tcW w:w="957" w:type="pct"/>
+            <w:tcW w:w="938" w:type="pct"/>
             <w:shd w:val="clear" w:color="auto" w:fill="auto"/>
             <w:vAlign w:val="center"/>
           </w:tcPr>
@@ -2518,13 +2494,13 @@
               <w:rPr>
                 <w:rFonts w:ascii="Cambria" w:hAnsi="Cambria"/>
               </w:rPr>
-              <w:t>View monitoring dashboard</w:t>
-            </w:r>
-          </w:p>
-        </w:tc>
-        <w:tc>
-          <w:tcPr>
-            <w:tcW w:w="3810" w:type="pct"/>
+              <w:t>View team commit statistics</w:t>
+            </w:r>
+          </w:p>
+        </w:tc>
+        <w:tc>
+          <w:tcPr>
+            <w:tcW w:w="3791" w:type="pct"/>
             <w:shd w:val="clear" w:color="auto" w:fill="auto"/>
             <w:vAlign w:val="center"/>
           </w:tcPr>
@@ -2538,7 +2514,7 @@
               <w:rPr>
                 <w:rFonts w:ascii="Cambria" w:hAnsi="Cambria"/>
               </w:rPr>
-              <w:t>Lecturer views dashboards to monitor project progress</w:t>
+              <w:t>The team leader views team commit statistics retrieved from GitHub.</w:t>
             </w:r>
           </w:p>
         </w:tc>
@@ -2546,7 +2522,7 @@
       <w:tr>
         <w:tc>
           <w:tcPr>
-            <w:tcW w:w="233" w:type="pct"/>
+            <w:tcW w:w="269" w:type="pct"/>
             <w:shd w:val="clear" w:color="auto" w:fill="auto"/>
             <w:vAlign w:val="center"/>
           </w:tcPr>
@@ -2569,7 +2545,7 @@
         </w:tc>
         <w:tc>
           <w:tcPr>
-            <w:tcW w:w="957" w:type="pct"/>
+            <w:tcW w:w="938" w:type="pct"/>
             <w:shd w:val="clear" w:color="auto" w:fill="auto"/>
             <w:vAlign w:val="center"/>
           </w:tcPr>
@@ -2583,13 +2559,13 @@
               <w:rPr>
                 <w:rFonts w:ascii="Cambria" w:hAnsi="Cambria"/>
               </w:rPr>
-              <w:t>Generate reports</w:t>
-            </w:r>
-          </w:p>
-        </w:tc>
-        <w:tc>
-          <w:tcPr>
-            <w:tcW w:w="3810" w:type="pct"/>
+              <w:t>Export SRS file</w:t>
+            </w:r>
+          </w:p>
+        </w:tc>
+        <w:tc>
+          <w:tcPr>
+            <w:tcW w:w="3791" w:type="pct"/>
             <w:shd w:val="clear" w:color="auto" w:fill="auto"/>
             <w:vAlign w:val="center"/>
           </w:tcPr>
@@ -2603,7 +2579,7 @@
               <w:rPr>
                 <w:rFonts w:ascii="Cambria" w:hAnsi="Cambria"/>
               </w:rPr>
-              <w:t>The system generates reports on team progress and individual contributions</w:t>
+              <w:t>The team leader exports the SRS document using requirement data retrieved from Jira.</w:t>
             </w:r>
           </w:p>
         </w:tc>
@@ -2611,7 +2587,7 @@
       <w:tr>
         <w:tc>
           <w:tcPr>
-            <w:tcW w:w="233" w:type="pct"/>
+            <w:tcW w:w="269" w:type="pct"/>
             <w:shd w:val="clear" w:color="auto" w:fill="auto"/>
             <w:vAlign w:val="center"/>
           </w:tcPr>
@@ -2634,7 +2610,7 @@
         </w:tc>
         <w:tc>
           <w:tcPr>
-            <w:tcW w:w="957" w:type="pct"/>
+            <w:tcW w:w="938" w:type="pct"/>
             <w:shd w:val="clear" w:color="auto" w:fill="auto"/>
             <w:vAlign w:val="center"/>
           </w:tcPr>
@@ -2648,13 +2624,13 @@
               <w:rPr>
                 <w:rFonts w:ascii="Cambria" w:hAnsi="Cambria"/>
               </w:rPr>
-              <w:t>Export SRS document</w:t>
-            </w:r>
-          </w:p>
-        </w:tc>
-        <w:tc>
-          <w:tcPr>
-            <w:tcW w:w="3810" w:type="pct"/>
+              <w:t>View personal task and commit statistics</w:t>
+            </w:r>
+          </w:p>
+        </w:tc>
+        <w:tc>
+          <w:tcPr>
+            <w:tcW w:w="3791" w:type="pct"/>
             <w:shd w:val="clear" w:color="auto" w:fill="auto"/>
             <w:vAlign w:val="center"/>
           </w:tcPr>
@@ -2668,72 +2644,7 @@
               <w:rPr>
                 <w:rFonts w:ascii="Cambria" w:hAnsi="Cambria"/>
               </w:rPr>
-              <w:t>The system generates and exports the Software Requirements Specification (SRS) document for download</w:t>
-            </w:r>
-          </w:p>
-        </w:tc>
-      </w:tr>
-      <w:tr>
-        <w:tc>
-          <w:tcPr>
-            <w:tcW w:w="233" w:type="pct"/>
-            <w:shd w:val="clear" w:color="auto" w:fill="auto"/>
-            <w:vAlign w:val="center"/>
-          </w:tcPr>
-          <w:p>
-            <w:pPr>
-              <w:ind w:left="34"/>
-              <w:rPr>
-                <w:rFonts w:ascii="Cambria" w:hAnsi="Cambria" w:cs="Calibri"/>
-                <w:lang w:val="en-US"/>
-              </w:rPr>
-            </w:pPr>
-            <w:r>
-              <w:rPr>
-                <w:rFonts w:ascii="Cambria" w:hAnsi="Cambria" w:cs="Calibri"/>
-                <w:lang w:val="en-US"/>
-              </w:rPr>
-              <w:t>14</w:t>
-            </w:r>
-          </w:p>
-        </w:tc>
-        <w:tc>
-          <w:tcPr>
-            <w:tcW w:w="957" w:type="pct"/>
-            <w:shd w:val="clear" w:color="auto" w:fill="auto"/>
-            <w:vAlign w:val="center"/>
-          </w:tcPr>
-          <w:p>
-            <w:pPr>
-              <w:rPr>
-                <w:rFonts w:ascii="Cambria" w:hAnsi="Cambria"/>
-              </w:rPr>
-            </w:pPr>
-            <w:r>
-              <w:rPr>
-                <w:rFonts w:ascii="Cambria" w:hAnsi="Cambria"/>
-              </w:rPr>
-              <w:t>Evaluate students</w:t>
-            </w:r>
-          </w:p>
-        </w:tc>
-        <w:tc>
-          <w:tcPr>
-            <w:tcW w:w="3810" w:type="pct"/>
-            <w:shd w:val="clear" w:color="auto" w:fill="auto"/>
-            <w:vAlign w:val="center"/>
-          </w:tcPr>
-          <w:p>
-            <w:pPr>
-              <w:rPr>
-                <w:rFonts w:ascii="Cambria" w:hAnsi="Cambria"/>
-              </w:rPr>
-            </w:pPr>
-            <w:r>
-              <w:rPr>
-                <w:rFonts w:ascii="Cambria" w:hAnsi="Cambria"/>
-              </w:rPr>
-              <w:t>Lecturer evaluates students based on generated reports and SRS data</w:t>
+              <w:t>The team member views personal task and commit statistics based on data from Jira and GitHub.</w:t>
             </w:r>
           </w:p>
         </w:tc>
@@ -2799,9 +2710,6 @@
   <w:sdt>
     <w:sdtPr>
       <w:id w:val="-1153064806"/>
-      <w:docPartObj>
-        <w:docPartGallery w:val="AutoText"/>
-      </w:docPartObj>
     </w:sdtPr>
     <w:sdtEndPr>
       <w:rPr>
@@ -2910,8 +2818,8 @@
     <w:lsdException w:name="index 7" w:semiHidden="1" w:unhideWhenUsed="1"/>
     <w:lsdException w:name="index 8" w:semiHidden="1" w:unhideWhenUsed="1"/>
     <w:lsdException w:name="index 9" w:semiHidden="1" w:unhideWhenUsed="1"/>
-    <w:lsdException w:name="toc 1" w:uiPriority="39" w:unhideWhenUsed="1"/>
-    <w:lsdException w:name="toc 2" w:uiPriority="39" w:unhideWhenUsed="1"/>
+    <w:lsdException w:name="toc 1" w:uiPriority="39" w:unhideWhenUsed="1" w:qFormat="1"/>
+    <w:lsdException w:name="toc 2" w:uiPriority="39" w:unhideWhenUsed="1" w:qFormat="1"/>
     <w:lsdException w:name="toc 3" w:uiPriority="39" w:unhideWhenUsed="1" w:qFormat="1"/>
     <w:lsdException w:name="toc 4" w:semiHidden="1" w:uiPriority="39" w:unhideWhenUsed="1"/>
     <w:lsdException w:name="toc 5" w:semiHidden="1" w:uiPriority="39" w:unhideWhenUsed="1"/>
@@ -2938,7 +2846,7 @@
     <w:lsdException w:name="table of authorities" w:semiHidden="1" w:unhideWhenUsed="1"/>
     <w:lsdException w:name="macro" w:semiHidden="1" w:unhideWhenUsed="1"/>
     <w:lsdException w:name="toa heading" w:semiHidden="1" w:unhideWhenUsed="1"/>
-    <w:lsdException w:name="List" w:semiHidden="1" w:uiPriority="0"/>
+    <w:lsdException w:name="List" w:semiHidden="1" w:uiPriority="0" w:qFormat="1"/>
     <w:lsdException w:name="List Bullet" w:semiHidden="1" w:unhideWhenUsed="1"/>
     <w:lsdException w:name="List Number" w:semiHidden="1" w:unhideWhenUsed="1"/>
     <w:lsdException w:name="List 2" w:semiHidden="1" w:unhideWhenUsed="1"/>
@@ -2956,8 +2864,8 @@
     <w:lsdException w:name="Title" w:uiPriority="10" w:qFormat="1"/>
     <w:lsdException w:name="Closing" w:semiHidden="1" w:unhideWhenUsed="1"/>
     <w:lsdException w:name="Signature" w:semiHidden="1" w:unhideWhenUsed="1"/>
-    <w:lsdException w:name="Default Paragraph Font" w:semiHidden="1" w:uiPriority="1" w:unhideWhenUsed="1" w:qFormat="1"/>
-    <w:lsdException w:name="Body Text" w:uiPriority="0"/>
+    <w:lsdException w:name="Default Paragraph Font" w:semiHidden="1" w:uiPriority="1" w:unhideWhenUsed="1"/>
+    <w:lsdException w:name="Body Text" w:uiPriority="0" w:qFormat="1"/>
     <w:lsdException w:name="Body Text Indent" w:semiHidden="1" w:unhideWhenUsed="1"/>
     <w:lsdException w:name="List Continue" w:semiHidden="1" w:unhideWhenUsed="1"/>
     <w:lsdException w:name="List Continue 2" w:semiHidden="1" w:unhideWhenUsed="1"/>
@@ -2976,7 +2884,7 @@
     <w:lsdException w:name="Body Text Indent 2" w:semiHidden="1" w:unhideWhenUsed="1"/>
     <w:lsdException w:name="Body Text Indent 3" w:semiHidden="1" w:unhideWhenUsed="1"/>
     <w:lsdException w:name="Block Text" w:semiHidden="1" w:unhideWhenUsed="1"/>
-    <w:lsdException w:name="Hyperlink" w:unhideWhenUsed="1"/>
+    <w:lsdException w:name="Hyperlink" w:unhideWhenUsed="1" w:qFormat="1"/>
     <w:lsdException w:name="FollowedHyperlink" w:semiHidden="1" w:unhideWhenUsed="1" w:qFormat="1"/>
     <w:lsdException w:name="Strong" w:uiPriority="22" w:qFormat="1"/>
     <w:lsdException w:name="Emphasis" w:uiPriority="20" w:qFormat="1"/>
@@ -2985,7 +2893,7 @@
     <w:lsdException w:name="E-mail Signature" w:semiHidden="1" w:unhideWhenUsed="1"/>
     <w:lsdException w:name="HTML Top of Form" w:semiHidden="1" w:unhideWhenUsed="1"/>
     <w:lsdException w:name="HTML Bottom of Form" w:semiHidden="1" w:unhideWhenUsed="1"/>
-    <w:lsdException w:name="Normal (Web)" w:semiHidden="1" w:unhideWhenUsed="1"/>
+    <w:lsdException w:name="Normal (Web)" w:semiHidden="1" w:unhideWhenUsed="1" w:qFormat="1"/>
     <w:lsdException w:name="HTML Acronym" w:semiHidden="1" w:unhideWhenUsed="1"/>
     <w:lsdException w:name="HTML Address" w:semiHidden="1" w:unhideWhenUsed="1"/>
     <w:lsdException w:name="HTML Cite" w:semiHidden="1" w:unhideWhenUsed="1"/>
@@ -3045,7 +2953,7 @@
     <w:lsdException w:name="Table Web 2" w:semiHidden="1" w:unhideWhenUsed="1"/>
     <w:lsdException w:name="Table Web 3" w:semiHidden="1" w:unhideWhenUsed="1"/>
     <w:lsdException w:name="Balloon Text" w:semiHidden="1" w:unhideWhenUsed="1"/>
-    <w:lsdException w:name="Table Grid" w:uiPriority="0"/>
+    <w:lsdException w:name="Table Grid" w:uiPriority="0" w:qFormat="1"/>
     <w:lsdException w:name="Table Theme" w:semiHidden="1" w:unhideWhenUsed="1"/>
     <w:lsdException w:name="Placeholder Text" w:semiHidden="1" w:unhideWhenUsed="1"/>
     <w:lsdException w:name="No Spacing" w:semiHidden="1" w:unhideWhenUsed="1"/>
@@ -3443,6 +3351,7 @@
     <w:name w:val="Body Text"/>
     <w:basedOn w:val="Normal"/>
     <w:link w:val="BodyTextChar"/>
+    <w:qFormat/>
     <w:pPr>
       <w:spacing w:after="60" w:line="240" w:lineRule="auto"/>
       <w:jc w:val="both"/>
@@ -3521,6 +3430,7 @@
     <w:basedOn w:val="DefaultParagraphFont"/>
     <w:uiPriority w:val="99"/>
     <w:unhideWhenUsed/>
+    <w:qFormat/>
     <w:rPr>
       <w:color w:val="0563C1" w:themeColor="hyperlink"/>
       <w:u w:val="single"/>
@@ -3530,6 +3440,7 @@
     <w:name w:val="List"/>
     <w:basedOn w:val="Normal"/>
     <w:semiHidden/>
+    <w:qFormat/>
     <w:pPr>
       <w:spacing w:after="120" w:line="240" w:lineRule="exact"/>
       <w:ind w:left="1353" w:hanging="806"/>
@@ -3547,6 +3458,7 @@
     <w:uiPriority w:val="99"/>
     <w:semiHidden/>
     <w:unhideWhenUsed/>
+    <w:qFormat/>
     <w:pPr>
       <w:spacing w:before="100" w:beforeAutospacing="1" w:after="100" w:afterAutospacing="1" w:line="240" w:lineRule="auto"/>
     </w:pPr>
@@ -3560,6 +3472,7 @@
   <w:style w:type="table" w:styleId="TableGrid">
     <w:name w:val="Table Grid"/>
     <w:basedOn w:val="TableNormal"/>
+    <w:qFormat/>
     <w:tblPr>
       <w:tblBorders>
         <w:top w:val="single" w:sz="4" w:space="0" w:color="auto"/>
@@ -3578,6 +3491,7 @@
     <w:autoRedefine/>
     <w:uiPriority w:val="39"/>
     <w:unhideWhenUsed/>
+    <w:qFormat/>
     <w:pPr>
       <w:spacing w:after="100"/>
     </w:pPr>
@@ -3589,6 +3503,7 @@
     <w:autoRedefine/>
     <w:uiPriority w:val="39"/>
     <w:unhideWhenUsed/>
+    <w:qFormat/>
     <w:pPr>
       <w:spacing w:after="100"/>
       <w:ind w:left="220"/>
@@ -3623,6 +3538,7 @@
     <w:basedOn w:val="DefaultParagraphFont"/>
     <w:link w:val="Heading1"/>
     <w:uiPriority w:val="9"/>
+    <w:qFormat/>
     <w:rPr>
       <w:rFonts w:asciiTheme="majorHAnsi" w:eastAsiaTheme="majorEastAsia" w:hAnsiTheme="majorHAnsi" w:cstheme="majorBidi"/>
       <w:b/>
@@ -3648,6 +3564,7 @@
     <w:basedOn w:val="DefaultParagraphFont"/>
     <w:link w:val="Heading3"/>
     <w:uiPriority w:val="9"/>
+    <w:qFormat/>
     <w:rPr>
       <w:rFonts w:asciiTheme="majorHAnsi" w:eastAsiaTheme="majorEastAsia" w:hAnsiTheme="majorHAnsi" w:cstheme="majorBidi"/>
       <w:b/>
@@ -3659,6 +3576,7 @@
     <w:name w:val="Kiểu2"/>
     <w:basedOn w:val="TableNormal"/>
     <w:uiPriority w:val="99"/>
+    <w:qFormat/>
     <w:rPr>
       <w:rFonts w:eastAsiaTheme="minorEastAsia"/>
       <w:sz w:val="24"/>
@@ -3712,6 +3630,7 @@
     <w:name w:val="Bangheader"/>
     <w:basedOn w:val="Heading7"/>
     <w:autoRedefine/>
+    <w:qFormat/>
     <w:pPr>
       <w:keepNext w:val="0"/>
       <w:keepLines w:val="0"/>
@@ -3749,6 +3668,7 @@
     <w:basedOn w:val="DefaultParagraphFont"/>
     <w:link w:val="Heading4"/>
     <w:uiPriority w:val="9"/>
+    <w:qFormat/>
     <w:rPr>
       <w:rFonts w:asciiTheme="majorHAnsi" w:eastAsiaTheme="majorEastAsia" w:hAnsiTheme="majorHAnsi" w:cstheme="majorBidi"/>
       <w:b/>
@@ -3761,10 +3681,12 @@
     <w:basedOn w:val="DefaultParagraphFont"/>
     <w:link w:val="ListParagraph"/>
     <w:uiPriority w:val="34"/>
+    <w:qFormat/>
   </w:style>
   <w:style w:type="character" w:customStyle="1" w:styleId="fontstyle01">
     <w:name w:val="fontstyle01"/>
     <w:basedOn w:val="DefaultParagraphFont"/>
+    <w:qFormat/>
     <w:rPr>
       <w:rFonts w:ascii="Helvetica" w:hAnsi="Helvetica" w:hint="default"/>
       <w:color w:val="000000"/>
@@ -3777,6 +3699,7 @@
     <w:basedOn w:val="DefaultParagraphFont"/>
     <w:link w:val="Header"/>
     <w:uiPriority w:val="99"/>
+    <w:qFormat/>
   </w:style>
   <w:style w:type="character" w:customStyle="1" w:styleId="FooterChar">
     <w:name w:val="Footer Char"/>
@@ -3824,6 +3747,7 @@
     <w:name w:val="Table Head"/>
     <w:basedOn w:val="Heading3"/>
     <w:next w:val="TableText"/>
+    <w:qFormat/>
     <w:pPr>
       <w:keepNext w:val="0"/>
       <w:keepLines w:val="0"/>
@@ -3842,6 +3766,7 @@
     <w:basedOn w:val="DefaultParagraphFont"/>
     <w:link w:val="Heading5"/>
     <w:uiPriority w:val="9"/>
+    <w:qFormat/>
     <w:rPr>
       <w:rFonts w:asciiTheme="majorHAnsi" w:eastAsiaTheme="majorEastAsia" w:hAnsiTheme="majorHAnsi" w:cstheme="majorBidi"/>
       <w:b/>
@@ -3911,6 +3836,7 @@
   <w:style w:type="paragraph" w:customStyle="1" w:styleId="TableTextsmall">
     <w:name w:val="Table Text small"/>
     <w:basedOn w:val="Normal"/>
+    <w:qFormat/>
     <w:pPr>
       <w:spacing w:after="20" w:line="240" w:lineRule="exact"/>
       <w:ind w:left="-14"/>
@@ -3925,6 +3851,7 @@
   <w:style w:type="paragraph" w:customStyle="1" w:styleId="level5">
     <w:name w:val="level 5"/>
     <w:basedOn w:val="Normal"/>
+    <w:qFormat/>
     <w:pPr>
       <w:tabs>
         <w:tab w:val="left" w:pos="2520"/>
@@ -3958,6 +3885,7 @@
     <w:name w:val="Body Text Char"/>
     <w:basedOn w:val="DefaultParagraphFont"/>
     <w:link w:val="BodyText"/>
+    <w:qFormat/>
     <w:rPr>
       <w:rFonts w:ascii="Times New Roman" w:eastAsia="Times New Roman" w:hAnsi="Times New Roman" w:cs="Times New Roman"/>
       <w:sz w:val="24"/>
@@ -3970,6 +3898,7 @@
     <w:basedOn w:val="Normal"/>
     <w:next w:val="BodyText"/>
     <w:autoRedefine/>
+    <w:qFormat/>
     <w:pPr>
       <w:widowControl w:val="0"/>
       <w:spacing w:after="0" w:line="240" w:lineRule="auto"/>

</xml_diff>